<commit_message>
TS 3.4 Tamil Kramam
</commit_message>
<xml_diff>
--- a/TS-Kramam/TS-3.5/TS 3.5 Tamil Krama Paatam Corrections.docx
+++ b/TS-Kramam/TS-3.5/TS 3.5 Tamil Krama Paatam Corrections.docx
@@ -141,12 +141,16 @@
               <w:spacing w:before="0" w:line="240" w:lineRule="auto"/>
               <w:jc w:val="center"/>
               <w:rPr>
+                <w:b/>
+                <w:bCs/>
                 <w:sz w:val="32"/>
                 <w:szCs w:val="32"/>
               </w:rPr>
             </w:pPr>
             <w:r>
               <w:rPr>
+                <w:b/>
+                <w:bCs/>
                 <w:sz w:val="32"/>
                 <w:szCs w:val="32"/>
               </w:rPr>
@@ -158,12 +162,16 @@
               <w:spacing w:before="0" w:line="240" w:lineRule="auto"/>
               <w:jc w:val="center"/>
               <w:rPr>
+                <w:b/>
+                <w:bCs/>
                 <w:sz w:val="32"/>
                 <w:szCs w:val="32"/>
               </w:rPr>
             </w:pPr>
             <w:r>
               <w:rPr>
+                <w:b/>
+                <w:bCs/>
                 <w:sz w:val="32"/>
                 <w:szCs w:val="32"/>
               </w:rPr>
@@ -180,12 +188,16 @@
               <w:spacing w:before="0" w:line="240" w:lineRule="auto"/>
               <w:jc w:val="center"/>
               <w:rPr>
+                <w:b/>
+                <w:bCs/>
                 <w:sz w:val="32"/>
                 <w:szCs w:val="32"/>
               </w:rPr>
             </w:pPr>
             <w:r>
               <w:rPr>
+                <w:b/>
+                <w:bCs/>
                 <w:sz w:val="32"/>
                 <w:szCs w:val="32"/>
               </w:rPr>
@@ -203,12 +215,16 @@
               <w:ind w:right="-18"/>
               <w:jc w:val="center"/>
               <w:rPr>
+                <w:b/>
+                <w:bCs/>
                 <w:sz w:val="32"/>
                 <w:szCs w:val="32"/>
               </w:rPr>
             </w:pPr>
             <w:r>
               <w:rPr>
+                <w:b/>
+                <w:bCs/>
                 <w:sz w:val="32"/>
                 <w:szCs w:val="32"/>
               </w:rPr>
@@ -3436,7 +3452,23 @@
                 <w:b/>
                 <w:bCs/>
               </w:rPr>
-              <w:t>(it is deergham)</w:t>
+              <w:t xml:space="preserve">(it is </w:t>
+            </w:r>
+            <w:proofErr w:type="spellStart"/>
+            <w:r>
+              <w:rPr>
+                <w:b/>
+                <w:bCs/>
+              </w:rPr>
+              <w:t>deergham</w:t>
+            </w:r>
+            <w:proofErr w:type="spellEnd"/>
+            <w:r>
+              <w:rPr>
+                <w:b/>
+                <w:bCs/>
+              </w:rPr>
+              <w:t>)</w:t>
             </w:r>
           </w:p>
         </w:tc>
@@ -5152,7 +5184,29 @@
           <w:lang w:val="en-IN" w:eastAsia="en-IN"/>
         </w:rPr>
         <w:lastRenderedPageBreak/>
-        <w:t xml:space="preserve">"zlÉ" </w:t>
+        <w:t>"</w:t>
+      </w:r>
+      <w:proofErr w:type="spellStart"/>
+      <w:r>
+        <w:rPr>
+          <w:rFonts w:ascii="BRH Devanagari" w:hAnsi="BRH Devanagari" w:cs="BRH Devanagari"/>
+          <w:color w:val="000000"/>
+          <w:sz w:val="40"/>
+          <w:szCs w:val="40"/>
+          <w:lang w:val="en-IN" w:eastAsia="en-IN"/>
+        </w:rPr>
+        <w:t>zlÉ</w:t>
+      </w:r>
+      <w:proofErr w:type="spellEnd"/>
+      <w:r>
+        <w:rPr>
+          <w:rFonts w:ascii="BRH Devanagari" w:hAnsi="BRH Devanagari" w:cs="BRH Devanagari"/>
+          <w:color w:val="000000"/>
+          <w:sz w:val="40"/>
+          <w:szCs w:val="40"/>
+          <w:lang w:val="en-IN" w:eastAsia="en-IN"/>
+        </w:rPr>
+        <w:t xml:space="preserve">" </w:t>
       </w:r>
       <w:r>
         <w:rPr>
@@ -5182,6 +5236,7 @@
         </w:rPr>
         <w:t>"</w:t>
       </w:r>
+      <w:proofErr w:type="spellStart"/>
       <w:r>
         <w:rPr>
           <w:rFonts w:ascii="BRH Devanagari" w:hAnsi="BRH Devanagari" w:cs="BRH Devanagari"/>
@@ -5193,6 +5248,7 @@
         </w:rPr>
         <w:t>zgÉ</w:t>
       </w:r>
+      <w:proofErr w:type="spellEnd"/>
       <w:r>
         <w:rPr>
           <w:rFonts w:ascii="BRH Devanagari" w:hAnsi="BRH Devanagari" w:cs="BRH Devanagari"/>
@@ -5595,6 +5651,8 @@
       <w:headerReference w:type="default" r:id="rId8"/>
       <w:footerReference w:type="even" r:id="rId9"/>
       <w:footerReference w:type="default" r:id="rId10"/>
+      <w:headerReference w:type="first" r:id="rId11"/>
+      <w:footerReference w:type="first" r:id="rId12"/>
       <w:pgSz w:w="15840" w:h="12240" w:orient="landscape"/>
       <w:pgMar w:top="1440" w:right="1440" w:bottom="1440" w:left="1440" w:header="720" w:footer="720" w:gutter="0"/>
       <w:cols w:space="720"/>
@@ -5683,14 +5741,35 @@
         <w:bCs/>
       </w:rPr>
       <w:tab/>
-      <w:t xml:space="preserve">              v</w:t>
+      <w:t xml:space="preserve">              </w:t>
     </w:r>
     <w:r>
       <w:rPr>
         <w:b/>
         <w:bCs/>
       </w:rPr>
-      <w:t>edavms@gmail.com</w:t>
+      <w:t>www.</w:t>
+    </w:r>
+    <w:r>
+      <w:rPr>
+        <w:b/>
+        <w:bCs/>
+      </w:rPr>
+      <w:t>v</w:t>
+    </w:r>
+    <w:r>
+      <w:rPr>
+        <w:b/>
+        <w:bCs/>
+      </w:rPr>
+      <w:t>edavms</w:t>
+    </w:r>
+    <w:r>
+      <w:rPr>
+        <w:b/>
+        <w:bCs/>
+      </w:rPr>
+      <w:t>.in</w:t>
     </w:r>
     <w:r>
       <w:rPr>
@@ -5711,7 +5790,13 @@
       <w:tab/>
     </w:r>
     <w:r>
+      <w:t xml:space="preserve">         </w:t>
+    </w:r>
+    <w:r>
       <w:t xml:space="preserve">           </w:t>
+    </w:r>
+    <w:r>
+      <w:t xml:space="preserve">  </w:t>
     </w:r>
     <w:r>
       <w:tab/>
@@ -6020,6 +6105,16 @@
 </w:ftr>
 </file>
 
+<file path=word/footer3.xml><?xml version="1.0" encoding="utf-8"?>
+<w:ftr xmlns:wpc="http://schemas.microsoft.com/office/word/2010/wordprocessingCanvas" xmlns:cx="http://schemas.microsoft.com/office/drawing/2014/chartex" xmlns:cx1="http://schemas.microsoft.com/office/drawing/2015/9/8/chartex" xmlns:cx2="http://schemas.microsoft.com/office/drawing/2015/10/21/chartex" xmlns:cx3="http://schemas.microsoft.com/office/drawing/2016/5/9/chartex" xmlns:cx4="http://schemas.microsoft.com/office/drawing/2016/5/10/chartex" xmlns:cx5="http://schemas.microsoft.com/office/drawing/2016/5/11/chartex" xmlns:cx6="http://schemas.microsoft.com/office/drawing/2016/5/12/chartex" xmlns:cx7="http://schemas.microsoft.com/office/drawing/2016/5/13/chartex" xmlns:cx8="http://schemas.microsoft.com/office/drawing/2016/5/14/chartex" xmlns:mc="http://schemas.openxmlformats.org/markup-compatibility/2006" xmlns:aink="http://schemas.microsoft.com/office/drawing/2016/ink" xmlns:am3d="http://schemas.microsoft.com/office/drawing/2017/model3d" xmlns:o="urn:schemas-microsoft-com:office:office" xmlns:oel="http://schemas.microsoft.com/office/2019/extlst" xmlns:r="http://schemas.openxmlformats.org/officeDocument/2006/relationships" xmlns:m="http://schemas.openxmlformats.org/officeDocument/2006/math" xmlns:v="urn:schemas-microsoft-com:vml" xmlns:wp14="http://schemas.microsoft.com/office/word/2010/wordprocessingDrawing" xmlns:wp="http://schemas.openxmlformats.org/drawingml/2006/wordprocessingDrawing" xmlns:w10="urn:schemas-microsoft-com:office:word" xmlns:w="http://schemas.openxmlformats.org/wordprocessingml/2006/main" xmlns:w14="http://schemas.microsoft.com/office/word/2010/wordml" xmlns:w15="http://schemas.microsoft.com/office/word/2012/wordml" xmlns:w16cex="http://schemas.microsoft.com/office/word/2018/wordml/cex" xmlns:w16cid="http://schemas.microsoft.com/office/word/2016/wordml/cid" xmlns:w16="http://schemas.microsoft.com/office/word/2018/wordml" xmlns:w16du="http://schemas.microsoft.com/office/word/2023/wordml/word16du" xmlns:w16sdtdh="http://schemas.microsoft.com/office/word/2020/wordml/sdtdatahash" xmlns:w16sdtfl="http://schemas.microsoft.com/office/word/2024/wordml/sdtformatlock" xmlns:w16se="http://schemas.microsoft.com/office/word/2015/wordml/symex" xmlns:wpg="http://schemas.microsoft.com/office/word/2010/wordprocessingGroup" xmlns:wpi="http://schemas.microsoft.com/office/word/2010/wordprocessingInk" xmlns:wne="http://schemas.microsoft.com/office/word/2006/wordml" xmlns:wps="http://schemas.microsoft.com/office/word/2010/wordprocessingShape" mc:Ignorable="w14 w15 w16se w16cid w16 w16cex w16sdtdh w16sdtfl w16du wp14">
+  <w:p>
+    <w:pPr>
+      <w:pStyle w:val="Footer"/>
+    </w:pPr>
+  </w:p>
+</w:ftr>
+</file>
+
 <file path=word/footnotes.xml><?xml version="1.0" encoding="utf-8"?>
 <w:footnotes xmlns:wpc="http://schemas.microsoft.com/office/word/2010/wordprocessingCanvas" xmlns:cx="http://schemas.microsoft.com/office/drawing/2014/chartex" xmlns:cx1="http://schemas.microsoft.com/office/drawing/2015/9/8/chartex" xmlns:cx2="http://schemas.microsoft.com/office/drawing/2015/10/21/chartex" xmlns:cx3="http://schemas.microsoft.com/office/drawing/2016/5/9/chartex" xmlns:cx4="http://schemas.microsoft.com/office/drawing/2016/5/10/chartex" xmlns:cx5="http://schemas.microsoft.com/office/drawing/2016/5/11/chartex" xmlns:cx6="http://schemas.microsoft.com/office/drawing/2016/5/12/chartex" xmlns:cx7="http://schemas.microsoft.com/office/drawing/2016/5/13/chartex" xmlns:cx8="http://schemas.microsoft.com/office/drawing/2016/5/14/chartex" xmlns:mc="http://schemas.openxmlformats.org/markup-compatibility/2006" xmlns:aink="http://schemas.microsoft.com/office/drawing/2016/ink" xmlns:am3d="http://schemas.microsoft.com/office/drawing/2017/model3d" xmlns:o="urn:schemas-microsoft-com:office:office" xmlns:oel="http://schemas.microsoft.com/office/2019/extlst" xmlns:r="http://schemas.openxmlformats.org/officeDocument/2006/relationships" xmlns:m="http://schemas.openxmlformats.org/officeDocument/2006/math" xmlns:v="urn:schemas-microsoft-com:vml" xmlns:wp14="http://schemas.microsoft.com/office/word/2010/wordprocessingDrawing" xmlns:wp="http://schemas.openxmlformats.org/drawingml/2006/wordprocessingDrawing" xmlns:w10="urn:schemas-microsoft-com:office:word" xmlns:w="http://schemas.openxmlformats.org/wordprocessingml/2006/main" xmlns:w14="http://schemas.microsoft.com/office/word/2010/wordml" xmlns:w15="http://schemas.microsoft.com/office/word/2012/wordml" xmlns:w16cex="http://schemas.microsoft.com/office/word/2018/wordml/cex" xmlns:w16cid="http://schemas.microsoft.com/office/word/2016/wordml/cid" xmlns:w16="http://schemas.microsoft.com/office/word/2018/wordml" xmlns:w16du="http://schemas.microsoft.com/office/word/2023/wordml/word16du" xmlns:w16sdtdh="http://schemas.microsoft.com/office/word/2020/wordml/sdtdatahash" xmlns:w16sdtfl="http://schemas.microsoft.com/office/word/2024/wordml/sdtformatlock" xmlns:w16se="http://schemas.microsoft.com/office/word/2015/wordml/symex" xmlns:wpg="http://schemas.microsoft.com/office/word/2010/wordprocessingGroup" xmlns:wpi="http://schemas.microsoft.com/office/word/2010/wordprocessingInk" xmlns:wne="http://schemas.microsoft.com/office/word/2006/wordml" xmlns:wps="http://schemas.microsoft.com/office/word/2010/wordprocessingShape" mc:Ignorable="w14 w15 w16se w16cid w16 w16cex w16sdtdh w16sdtfl w16du wp14">
   <w:footnote w:type="separator" w:id="-1">
@@ -6066,6 +6161,16 @@
       <w:pBdr>
         <w:bottom w:val="single" w:sz="4" w:space="1" w:color="auto"/>
       </w:pBdr>
+    </w:pPr>
+  </w:p>
+</w:hdr>
+</file>
+
+<file path=word/header3.xml><?xml version="1.0" encoding="utf-8"?>
+<w:hdr xmlns:wpc="http://schemas.microsoft.com/office/word/2010/wordprocessingCanvas" xmlns:cx="http://schemas.microsoft.com/office/drawing/2014/chartex" xmlns:cx1="http://schemas.microsoft.com/office/drawing/2015/9/8/chartex" xmlns:cx2="http://schemas.microsoft.com/office/drawing/2015/10/21/chartex" xmlns:cx3="http://schemas.microsoft.com/office/drawing/2016/5/9/chartex" xmlns:cx4="http://schemas.microsoft.com/office/drawing/2016/5/10/chartex" xmlns:cx5="http://schemas.microsoft.com/office/drawing/2016/5/11/chartex" xmlns:cx6="http://schemas.microsoft.com/office/drawing/2016/5/12/chartex" xmlns:cx7="http://schemas.microsoft.com/office/drawing/2016/5/13/chartex" xmlns:cx8="http://schemas.microsoft.com/office/drawing/2016/5/14/chartex" xmlns:mc="http://schemas.openxmlformats.org/markup-compatibility/2006" xmlns:aink="http://schemas.microsoft.com/office/drawing/2016/ink" xmlns:am3d="http://schemas.microsoft.com/office/drawing/2017/model3d" xmlns:o="urn:schemas-microsoft-com:office:office" xmlns:oel="http://schemas.microsoft.com/office/2019/extlst" xmlns:r="http://schemas.openxmlformats.org/officeDocument/2006/relationships" xmlns:m="http://schemas.openxmlformats.org/officeDocument/2006/math" xmlns:v="urn:schemas-microsoft-com:vml" xmlns:wp14="http://schemas.microsoft.com/office/word/2010/wordprocessingDrawing" xmlns:wp="http://schemas.openxmlformats.org/drawingml/2006/wordprocessingDrawing" xmlns:w10="urn:schemas-microsoft-com:office:word" xmlns:w="http://schemas.openxmlformats.org/wordprocessingml/2006/main" xmlns:w14="http://schemas.microsoft.com/office/word/2010/wordml" xmlns:w15="http://schemas.microsoft.com/office/word/2012/wordml" xmlns:w16cex="http://schemas.microsoft.com/office/word/2018/wordml/cex" xmlns:w16cid="http://schemas.microsoft.com/office/word/2016/wordml/cid" xmlns:w16="http://schemas.microsoft.com/office/word/2018/wordml" xmlns:w16du="http://schemas.microsoft.com/office/word/2023/wordml/word16du" xmlns:w16sdtdh="http://schemas.microsoft.com/office/word/2020/wordml/sdtdatahash" xmlns:w16sdtfl="http://schemas.microsoft.com/office/word/2024/wordml/sdtformatlock" xmlns:w16se="http://schemas.microsoft.com/office/word/2015/wordml/symex" xmlns:wpg="http://schemas.microsoft.com/office/word/2010/wordprocessingGroup" xmlns:wpi="http://schemas.microsoft.com/office/word/2010/wordprocessingInk" xmlns:wne="http://schemas.microsoft.com/office/word/2006/wordml" xmlns:wps="http://schemas.microsoft.com/office/word/2010/wordprocessingShape" mc:Ignorable="w14 w15 w16se w16cid w16 w16cex w16sdtdh w16sdtfl w16du wp14">
+  <w:p>
+    <w:pPr>
+      <w:pStyle w:val="Header"/>
     </w:pPr>
   </w:p>
 </w:hdr>

</xml_diff>